<commit_message>
reconstruct lands beyond law
</commit_message>
<xml_diff>
--- a/docs/source/_static/files/Letter.docx
+++ b/docs/source/_static/files/Letter.docx
@@ -14274,7 +14274,37 @@
         <w:rPr>
           <w:rFonts w:hint="eastAsia"/>
         </w:rPr>
-        <w:t>和精神追求，都有自己存在的价值。。。不同国家民族的思想文化各有千秋，只有姹紫嫣红之别，没有高低优劣之分。。。。”</w:t>
+        <w:t>和精神追求，都有自己存在的价值</w:t>
+      </w:r>
+      <w:r>
+        <w:rPr>
+          <w:rFonts w:ascii="Consolas" w:eastAsia="宋体" w:hAnsi="Consolas" w:cs="宋体"/>
+          <w:color w:val="BBBBBB"/>
+          <w:kern w:val="0"/>
+          <w:szCs w:val="21"/>
+        </w:rPr>
+        <w:t>……</w:t>
+      </w:r>
+      <w:r>
+        <w:rPr>
+          <w:rFonts w:hint="eastAsia"/>
+        </w:rPr>
+        <w:t>不同国家民族的思想文化各有千秋，只有姹紫嫣红之别，没有高低优劣之分</w:t>
+      </w:r>
+      <w:r>
+        <w:rPr>
+          <w:rFonts w:ascii="Consolas" w:eastAsia="宋体" w:hAnsi="Consolas" w:cs="宋体"/>
+          <w:color w:val="BBBBBB"/>
+          <w:kern w:val="0"/>
+          <w:szCs w:val="21"/>
+        </w:rPr>
+        <w:t>……</w:t>
+      </w:r>
+      <w:r>
+        <w:rPr>
+          <w:rFonts w:hint="eastAsia"/>
+        </w:rPr>
+        <w:t>”</w:t>
       </w:r>
     </w:p>
     <w:p>
@@ -14285,7 +14315,60 @@
         <w:rPr>
           <w:rFonts w:hint="eastAsia"/>
         </w:rPr>
-        <w:t>“每一种文明都是美的结晶，都彰显着创造之美。。。。一切美好的东西都是相通的，人类对美好事物的追求和向往是任何力量都无法阻挡的。。。。我们应该美人之美，美美与共。。。”</w:t>
+        <w:t>“每一种文明都是美的结晶，都彰显着创造之美</w:t>
+      </w:r>
+      <w:r>
+        <w:rPr>
+          <w:rFonts w:ascii="Consolas" w:eastAsia="宋体" w:hAnsi="Consolas" w:cs="宋体"/>
+          <w:color w:val="BBBBBB"/>
+          <w:kern w:val="0"/>
+          <w:szCs w:val="21"/>
+        </w:rPr>
+        <w:t>……</w:t>
+      </w:r>
+      <w:r>
+        <w:rPr>
+          <w:rFonts w:hint="eastAsia"/>
+        </w:rPr>
+        <w:t>一切美好的</w:t>
+      </w:r>
+      <w:bookmarkStart w:id="3" w:name="_GoBack"/>
+      <w:bookmarkEnd w:id="3"/>
+      <w:r>
+        <w:rPr>
+          <w:rFonts w:hint="eastAsia"/>
+        </w:rPr>
+        <w:t>东西都是相通的，人类对美好事物的追求和向往是任何力量都无法阻挡的</w:t>
+      </w:r>
+      <w:r>
+        <w:rPr>
+          <w:rFonts w:ascii="Consolas" w:eastAsia="宋体" w:hAnsi="Consolas" w:cs="宋体"/>
+          <w:color w:val="BBBBBB"/>
+          <w:kern w:val="0"/>
+          <w:szCs w:val="21"/>
+        </w:rPr>
+        <w:t>……</w:t>
+      </w:r>
+      <w:r>
+        <w:rPr>
+          <w:rFonts w:hint="eastAsia"/>
+        </w:rPr>
+        <w:t>我们应该美人之美，美美与共</w:t>
+      </w:r>
+      <w:r>
+        <w:rPr>
+          <w:rFonts w:ascii="Consolas" w:eastAsia="宋体" w:hAnsi="Consolas" w:cs="宋体"/>
+          <w:color w:val="BBBBBB"/>
+          <w:kern w:val="0"/>
+          <w:szCs w:val="21"/>
+        </w:rPr>
+        <w:t>……</w:t>
+      </w:r>
+      <w:r>
+        <w:rPr>
+          <w:rFonts w:hint="eastAsia"/>
+        </w:rPr>
+        <w:t>”</w:t>
       </w:r>
     </w:p>
     <w:p>
@@ -14300,15 +14383,18 @@
       </w:r>
       <w:r>
         <w:rPr>
-          <w:rFonts w:hint="eastAsia"/>
-        </w:rPr>
-        <w:t>。。</w:t>
-      </w:r>
-      <w:r>
-        <w:rPr>
-          <w:rFonts w:hint="eastAsia"/>
-        </w:rPr>
-        <w:t>。”</w:t>
+          <w:rFonts w:ascii="Consolas" w:eastAsia="宋体" w:hAnsi="Consolas" w:cs="宋体"/>
+          <w:color w:val="BBBBBB"/>
+          <w:kern w:val="0"/>
+          <w:szCs w:val="21"/>
+        </w:rPr>
+        <w:t>……</w:t>
+      </w:r>
+      <w:r>
+        <w:rPr>
+          <w:rFonts w:hint="eastAsia"/>
+        </w:rPr>
+        <w:t>”</w:t>
       </w:r>
       <w:r>
         <w:rPr>
@@ -16808,15 +16894,7 @@
         <w:rPr>
           <w:rFonts w:hint="eastAsia"/>
         </w:rPr>
-        <w:t>目前的我被剥夺了自我辩护，控告和检举的基本公民权利，被隔绝了一切外部联系并被限制了基本人身自由，并一天天地忍受着狱警们五花八门光怪陆离的刁难和折磨。但作为科学研究者，”因果循环，报应不爽”这一佛教信仰，也是我心中的基本信条；我坚信罪恶的黑幕永远不可能掩盖真理的光辉。另外，作为一个对中国强国建设和民族复兴具有坚定信念的新一代中国公民，我相信中国社会必将进入法</w:t>
-      </w:r>
-      <w:bookmarkStart w:id="3" w:name="_GoBack"/>
-      <w:bookmarkEnd w:id="3"/>
-      <w:r>
-        <w:rPr>
-          <w:rFonts w:hint="eastAsia"/>
-        </w:rPr>
-        <w:t>治正轨，”天网恢恢、疏而不漏”也必将是历史的必然！</w:t>
+        <w:t>目前的我被剥夺了自我辩护，控告和检举的基本公民权利，被隔绝了一切外部联系并被限制了基本人身自由，并一天天地忍受着狱警们五花八门光怪陆离的刁难和折磨。但作为科学研究者，”因果循环，报应不爽”这一佛教信仰，也是我心中的基本信条；我坚信罪恶的黑幕永远不可能掩盖真理的光辉。另外，作为一个对中国强国建设和民族复兴具有坚定信念的新一代中国公民，我相信中国社会必将进入法治正轨，”天网恢恢、疏而不漏”也必将是历史的必然！</w:t>
       </w:r>
     </w:p>
     <w:p/>

</xml_diff>